<commit_message>
Fold Qwen Editor + SamaritanX into CVs as headline projects
- Software Engineering CV: Qwen Editor now leads the experience section
- Cybersecurity CV: SamaritanX now leads the experience section
- Regenerate both PDFs; bump service worker cache to v11

Co-Authored-By: Claude Opus 4.8 <noreply@anthropic.com>
</commit_message>
<xml_diff>
--- a/assets/Resume_Cybersecurity(1).docx
+++ b/assets/Resume_Cybersecurity(1).docx
@@ -393,6 +393,25 @@
           <w:szCs w:val="19"/>
         </w:rPr>
         <w:t xml:space="preserve">2019 – Present</w:t>
+      </w:r>
+    </w:p>
+    <w:p>
+      <w:pPr>
+        <w:pStyle w:val="ListParagraph"/>
+        <w:numPr>
+          <w:ilvl w:val="0"/>
+          <w:numId w:val="2"/>
+        </w:numPr>
+        <w:spacing w:after="20" w:before="20"/>
+      </w:pPr>
+      <w:r>
+        <w:rPr>
+          <w:rFonts w:ascii="Calibri" w:cs="Calibri" w:eastAsia="Calibri" w:hAnsi="Calibri"/>
+          <w:color w:val="1A1A2E"/>
+          <w:sz w:val="20"/>
+          <w:szCs w:val="20"/>
+        </w:rPr>
+        <w:t xml:space="preserve">Built SamaritanX — an agentic bug-bounty framework (Python, asyncio) from scratch: autonomous agents for recon, crawl, 12-category vulnerability scanning, logic abuse, and exploit-chain synthesis, with HTTP-boundary scope enforcement, interactsh OOB validation, and automated MD/PDF reporting. (github.com/Th3Samaritan/SamaritanX)</w:t>
       </w:r>
     </w:p>
     <w:p>

</xml_diff>